<commit_message>
Week 4 content is added
</commit_message>
<xml_diff>
--- a/docs/do_not_upload/Assignment1/Assignment 1.docx
+++ b/docs/do_not_upload/Assignment1/Assignment 1.docx
@@ -5518,22 +5518,43 @@
           <w:numId w:val="11"/>
         </w:numPr>
         <w:spacing w:before="0" w:beforeAutospacing="0" w:after="0" w:afterAutospacing="0"/>
-      </w:pPr>
-      <w:r>
         <w:rPr>
           <w:rStyle w:val="Strong"/>
           <w:b w:val="0"/>
           <w:bCs w:val="0"/>
         </w:rPr>
-        <w:t>English</w:t>
-      </w:r>
+      </w:pPr>
       <w:r>
         <w:rPr>
           <w:rStyle w:val="Strong"/>
           <w:b w:val="0"/>
           <w:bCs w:val="0"/>
         </w:rPr>
-        <w:t xml:space="preserve"> (1)</w:t>
+        <w:t>Non-English</w:t>
+      </w:r>
+      <w:r>
+        <w:rPr>
+          <w:rStyle w:val="Strong"/>
+          <w:b w:val="0"/>
+          <w:bCs w:val="0"/>
+        </w:rPr>
+        <w:t xml:space="preserve"> (</w:t>
+      </w:r>
+      <w:r>
+        <w:rPr>
+          <w:rStyle w:val="Strong"/>
+          <w:b w:val="0"/>
+          <w:bCs w:val="0"/>
+        </w:rPr>
+        <w:t>1</w:t>
+      </w:r>
+      <w:r>
+        <w:rPr>
+          <w:rStyle w:val="Strong"/>
+          <w:b w:val="0"/>
+          <w:bCs w:val="0"/>
+        </w:rPr>
+        <w:t>)</w:t>
       </w:r>
     </w:p>
     <w:p>
@@ -5551,7 +5572,7 @@
           <w:b w:val="0"/>
           <w:bCs w:val="0"/>
         </w:rPr>
-        <w:t>Non-English</w:t>
+        <w:t>English</w:t>
       </w:r>
       <w:r>
         <w:rPr>
@@ -5559,7 +5580,23 @@
           <w:b w:val="0"/>
           <w:bCs w:val="0"/>
         </w:rPr>
-        <w:t xml:space="preserve"> (2)</w:t>
+        <w:t xml:space="preserve"> (</w:t>
+      </w:r>
+      <w:r>
+        <w:rPr>
+          <w:rStyle w:val="Strong"/>
+          <w:b w:val="0"/>
+          <w:bCs w:val="0"/>
+        </w:rPr>
+        <w:t>2</w:t>
+      </w:r>
+      <w:r>
+        <w:rPr>
+          <w:rStyle w:val="Strong"/>
+          <w:b w:val="0"/>
+          <w:bCs w:val="0"/>
+        </w:rPr>
+        <w:t>)</w:t>
       </w:r>
     </w:p>
     <w:p>
@@ -8460,33 +8497,33 @@
       </w:r>
       <w:r>
         <w:rPr>
+          <w:rStyle w:val="hljs-string"/>
+        </w:rPr>
+        <w:t xml:space="preserve">, </w:t>
+      </w:r>
+      <w:r>
+        <w:rPr>
+          <w:rStyle w:val="hljs-string"/>
+        </w:rPr>
+        <w:t>"</w:t>
+      </w:r>
+      <w:r>
+        <w:rPr>
           <w:rStyle w:val="hljs-punctuation"/>
         </w:rPr>
+        <w:t>English</w:t>
+      </w:r>
+      <w:r>
+        <w:rPr>
+          <w:rStyle w:val="hljs-string"/>
+        </w:rPr>
+        <w:t>"</w:t>
+      </w:r>
+      <w:r>
+        <w:rPr>
+          <w:rStyle w:val="hljs-punctuation"/>
+        </w:rPr>
         <w:t>,</w:t>
-      </w:r>
-      <w:r>
-        <w:rPr>
-          <w:rStyle w:val="HTMLCode"/>
-        </w:rPr>
-        <w:t xml:space="preserve"> </w:t>
-      </w:r>
-      <w:r>
-        <w:rPr>
-          <w:rStyle w:val="hljs-string"/>
-        </w:rPr>
-        <w:t>"English"</w:t>
-      </w:r>
-      <w:r>
-        <w:rPr>
-          <w:rStyle w:val="hljs-punctuation"/>
-        </w:rPr>
-        <w:t>,</w:t>
-      </w:r>
-      <w:r>
-        <w:rPr>
-          <w:rStyle w:val="HTMLCode"/>
-        </w:rPr>
-        <w:t xml:space="preserve"> </w:t>
       </w:r>
       <w:r>
         <w:rPr>

</xml_diff>